<commit_message>
gerbers, pcb, and sch all correct now. Improved docs
</commit_message>
<xml_diff>
--- a/RB_Switch_Paraprofessional_Setup_Guide.docx
+++ b/RB_Switch_Paraprofessional_Setup_Guide.docx
@@ -5,7 +5,6 @@
     <w:p>
       <w:pPr>
         <w:spacing w:after="60"/>
-        <w:jc w:val="left"/>
       </w:pPr>
       <w:r>
         <w:rPr>
@@ -146,10 +145,10 @@
         </w:tblBorders>
       </w:tblPr>
       <w:tblGrid>
-        <w:gridCol w:w="1550"/>
-        <w:gridCol w:w="1550"/>
-        <w:gridCol w:w="2132"/>
-        <w:gridCol w:w="4848"/>
+        <w:gridCol w:w="1209"/>
+        <w:gridCol w:w="1612"/>
+        <w:gridCol w:w="2217"/>
+        <w:gridCol w:w="5042"/>
       </w:tblGrid>
       <w:tr>
         <w:trPr>
@@ -158,7 +157,7 @@
         </w:trPr>
         <w:tc>
           <w:tcPr>
-            <w:tcW w:type="dxa" w:w="1550"/>
+            <w:tcW w:type="dxa" w:w="1209"/>
             <w:tcBorders>
               <w:top w:val="single" w:color="999999" w:sz="4"/>
               <w:left w:val="single" w:color="999999" w:sz="4"/>
@@ -167,15 +166,16 @@
             </w:tcBorders>
             <w:shd w:fill="DCE6F1" w:color="auto" w:val="clear"/>
             <w:tcMar>
-              <w:top w:type="dxa" w:w="60"/>
-              <w:left w:type="dxa" w:w="100"/>
-              <w:bottom w:type="dxa" w:w="60"/>
-              <w:right w:type="dxa" w:w="100"/>
-            </w:tcMar>
-          </w:tcPr>
-          <w:p>
-            <w:pPr>
-              <w:spacing w:after="0"/>
+              <w:top w:type="dxa" w:w="50"/>
+              <w:left w:type="dxa" w:w="90"/>
+              <w:bottom w:type="dxa" w:w="50"/>
+              <w:right w:type="dxa" w:w="90"/>
+            </w:tcMar>
+          </w:tcPr>
+          <w:p>
+            <w:pPr>
+              <w:spacing w:after="0"/>
+              <w:jc w:val="left"/>
             </w:pPr>
             <w:r>
               <w:rPr>
@@ -191,7 +191,7 @@
         </w:tc>
         <w:tc>
           <w:tcPr>
-            <w:tcW w:type="dxa" w:w="1550"/>
+            <w:tcW w:type="dxa" w:w="1612"/>
             <w:tcBorders>
               <w:top w:val="single" w:color="999999" w:sz="4"/>
               <w:left w:val="single" w:color="999999" w:sz="4"/>
@@ -200,15 +200,16 @@
             </w:tcBorders>
             <w:shd w:fill="DCE6F1" w:color="auto" w:val="clear"/>
             <w:tcMar>
-              <w:top w:type="dxa" w:w="60"/>
-              <w:left w:type="dxa" w:w="100"/>
-              <w:bottom w:type="dxa" w:w="60"/>
-              <w:right w:type="dxa" w:w="100"/>
-            </w:tcMar>
-          </w:tcPr>
-          <w:p>
-            <w:pPr>
-              <w:spacing w:after="0"/>
+              <w:top w:type="dxa" w:w="50"/>
+              <w:left w:type="dxa" w:w="90"/>
+              <w:bottom w:type="dxa" w:w="50"/>
+              <w:right w:type="dxa" w:w="90"/>
+            </w:tcMar>
+          </w:tcPr>
+          <w:p>
+            <w:pPr>
+              <w:spacing w:after="0"/>
+              <w:jc w:val="left"/>
             </w:pPr>
             <w:r>
               <w:rPr>
@@ -224,7 +225,7 @@
         </w:tc>
         <w:tc>
           <w:tcPr>
-            <w:tcW w:type="dxa" w:w="2132"/>
+            <w:tcW w:type="dxa" w:w="2217"/>
             <w:tcBorders>
               <w:top w:val="single" w:color="999999" w:sz="4"/>
               <w:left w:val="single" w:color="999999" w:sz="4"/>
@@ -233,15 +234,16 @@
             </w:tcBorders>
             <w:shd w:fill="DCE6F1" w:color="auto" w:val="clear"/>
             <w:tcMar>
-              <w:top w:type="dxa" w:w="60"/>
-              <w:left w:type="dxa" w:w="100"/>
-              <w:bottom w:type="dxa" w:w="60"/>
-              <w:right w:type="dxa" w:w="100"/>
-            </w:tcMar>
-          </w:tcPr>
-          <w:p>
-            <w:pPr>
-              <w:spacing w:after="0"/>
+              <w:top w:type="dxa" w:w="50"/>
+              <w:left w:type="dxa" w:w="90"/>
+              <w:bottom w:type="dxa" w:w="50"/>
+              <w:right w:type="dxa" w:w="90"/>
+            </w:tcMar>
+          </w:tcPr>
+          <w:p>
+            <w:pPr>
+              <w:spacing w:after="0"/>
+              <w:jc w:val="left"/>
             </w:pPr>
             <w:r>
               <w:rPr>
@@ -257,7 +259,7 @@
         </w:tc>
         <w:tc>
           <w:tcPr>
-            <w:tcW w:type="dxa" w:w="4848"/>
+            <w:tcW w:type="dxa" w:w="5042"/>
             <w:tcBorders>
               <w:top w:val="single" w:color="999999" w:sz="4"/>
               <w:left w:val="single" w:color="999999" w:sz="4"/>
@@ -266,15 +268,16 @@
             </w:tcBorders>
             <w:shd w:fill="DCE6F1" w:color="auto" w:val="clear"/>
             <w:tcMar>
-              <w:top w:type="dxa" w:w="60"/>
-              <w:left w:type="dxa" w:w="100"/>
-              <w:bottom w:type="dxa" w:w="60"/>
-              <w:right w:type="dxa" w:w="100"/>
-            </w:tcMar>
-          </w:tcPr>
-          <w:p>
-            <w:pPr>
-              <w:spacing w:after="0"/>
+              <w:top w:type="dxa" w:w="50"/>
+              <w:left w:type="dxa" w:w="90"/>
+              <w:bottom w:type="dxa" w:w="50"/>
+              <w:right w:type="dxa" w:w="90"/>
+            </w:tcMar>
+          </w:tcPr>
+          <w:p>
+            <w:pPr>
+              <w:spacing w:after="0"/>
+              <w:jc w:val="left"/>
             </w:pPr>
             <w:r>
               <w:rPr>
@@ -295,23 +298,24 @@
         </w:trPr>
         <w:tc>
           <w:tcPr>
-            <w:tcW w:type="dxa" w:w="1550"/>
-            <w:tcBorders>
-              <w:top w:val="single" w:color="999999" w:sz="4"/>
-              <w:left w:val="single" w:color="999999" w:sz="4"/>
-              <w:bottom w:val="single" w:color="999999" w:sz="4"/>
-              <w:right w:val="single" w:color="999999" w:sz="4"/>
-            </w:tcBorders>
-            <w:tcMar>
-              <w:top w:type="dxa" w:w="60"/>
-              <w:left w:type="dxa" w:w="100"/>
-              <w:bottom w:type="dxa" w:w="60"/>
-              <w:right w:type="dxa" w:w="100"/>
-            </w:tcMar>
-          </w:tcPr>
-          <w:p>
-            <w:pPr>
-              <w:spacing w:after="0"/>
+            <w:tcW w:type="dxa" w:w="1209"/>
+            <w:tcBorders>
+              <w:top w:val="single" w:color="999999" w:sz="4"/>
+              <w:left w:val="single" w:color="999999" w:sz="4"/>
+              <w:bottom w:val="single" w:color="999999" w:sz="4"/>
+              <w:right w:val="single" w:color="999999" w:sz="4"/>
+            </w:tcBorders>
+            <w:tcMar>
+              <w:top w:type="dxa" w:w="50"/>
+              <w:left w:type="dxa" w:w="90"/>
+              <w:bottom w:type="dxa" w:w="50"/>
+              <w:right w:type="dxa" w:w="90"/>
+            </w:tcMar>
+          </w:tcPr>
+          <w:p>
+            <w:pPr>
+              <w:spacing w:after="0"/>
+              <w:jc w:val="left"/>
             </w:pPr>
             <w:r>
               <w:rPr>
@@ -325,23 +329,24 @@
         </w:tc>
         <w:tc>
           <w:tcPr>
-            <w:tcW w:type="dxa" w:w="1550"/>
-            <w:tcBorders>
-              <w:top w:val="single" w:color="999999" w:sz="4"/>
-              <w:left w:val="single" w:color="999999" w:sz="4"/>
-              <w:bottom w:val="single" w:color="999999" w:sz="4"/>
-              <w:right w:val="single" w:color="999999" w:sz="4"/>
-            </w:tcBorders>
-            <w:tcMar>
-              <w:top w:type="dxa" w:w="60"/>
-              <w:left w:type="dxa" w:w="100"/>
-              <w:bottom w:type="dxa" w:w="60"/>
-              <w:right w:type="dxa" w:w="100"/>
-            </w:tcMar>
-          </w:tcPr>
-          <w:p>
-            <w:pPr>
-              <w:spacing w:after="0"/>
+            <w:tcW w:type="dxa" w:w="1612"/>
+            <w:tcBorders>
+              <w:top w:val="single" w:color="999999" w:sz="4"/>
+              <w:left w:val="single" w:color="999999" w:sz="4"/>
+              <w:bottom w:val="single" w:color="999999" w:sz="4"/>
+              <w:right w:val="single" w:color="999999" w:sz="4"/>
+            </w:tcBorders>
+            <w:tcMar>
+              <w:top w:type="dxa" w:w="50"/>
+              <w:left w:type="dxa" w:w="90"/>
+              <w:bottom w:type="dxa" w:w="50"/>
+              <w:right w:type="dxa" w:w="90"/>
+            </w:tcMar>
+          </w:tcPr>
+          <w:p>
+            <w:pPr>
+              <w:spacing w:after="0"/>
+              <w:jc w:val="left"/>
             </w:pPr>
             <w:r>
               <w:rPr>
@@ -355,23 +360,24 @@
         </w:tc>
         <w:tc>
           <w:tcPr>
-            <w:tcW w:type="dxa" w:w="2132"/>
-            <w:tcBorders>
-              <w:top w:val="single" w:color="999999" w:sz="4"/>
-              <w:left w:val="single" w:color="999999" w:sz="4"/>
-              <w:bottom w:val="single" w:color="999999" w:sz="4"/>
-              <w:right w:val="single" w:color="999999" w:sz="4"/>
-            </w:tcBorders>
-            <w:tcMar>
-              <w:top w:type="dxa" w:w="60"/>
-              <w:left w:type="dxa" w:w="100"/>
-              <w:bottom w:type="dxa" w:w="60"/>
-              <w:right w:type="dxa" w:w="100"/>
-            </w:tcMar>
-          </w:tcPr>
-          <w:p>
-            <w:pPr>
-              <w:spacing w:after="0"/>
+            <w:tcW w:type="dxa" w:w="2217"/>
+            <w:tcBorders>
+              <w:top w:val="single" w:color="999999" w:sz="4"/>
+              <w:left w:val="single" w:color="999999" w:sz="4"/>
+              <w:bottom w:val="single" w:color="999999" w:sz="4"/>
+              <w:right w:val="single" w:color="999999" w:sz="4"/>
+            </w:tcBorders>
+            <w:tcMar>
+              <w:top w:type="dxa" w:w="50"/>
+              <w:left w:type="dxa" w:w="90"/>
+              <w:bottom w:type="dxa" w:w="50"/>
+              <w:right w:type="dxa" w:w="90"/>
+            </w:tcMar>
+          </w:tcPr>
+          <w:p>
+            <w:pPr>
+              <w:spacing w:after="0"/>
+              <w:jc w:val="left"/>
             </w:pPr>
             <w:r>
               <w:rPr>
@@ -385,23 +391,24 @@
         </w:tc>
         <w:tc>
           <w:tcPr>
-            <w:tcW w:type="dxa" w:w="4848"/>
-            <w:tcBorders>
-              <w:top w:val="single" w:color="999999" w:sz="4"/>
-              <w:left w:val="single" w:color="999999" w:sz="4"/>
-              <w:bottom w:val="single" w:color="999999" w:sz="4"/>
-              <w:right w:val="single" w:color="999999" w:sz="4"/>
-            </w:tcBorders>
-            <w:tcMar>
-              <w:top w:type="dxa" w:w="60"/>
-              <w:left w:type="dxa" w:w="100"/>
-              <w:bottom w:type="dxa" w:w="60"/>
-              <w:right w:type="dxa" w:w="100"/>
-            </w:tcMar>
-          </w:tcPr>
-          <w:p>
-            <w:pPr>
-              <w:spacing w:after="0"/>
+            <w:tcW w:type="dxa" w:w="5042"/>
+            <w:tcBorders>
+              <w:top w:val="single" w:color="999999" w:sz="4"/>
+              <w:left w:val="single" w:color="999999" w:sz="4"/>
+              <w:bottom w:val="single" w:color="999999" w:sz="4"/>
+              <w:right w:val="single" w:color="999999" w:sz="4"/>
+            </w:tcBorders>
+            <w:tcMar>
+              <w:top w:type="dxa" w:w="50"/>
+              <w:left w:type="dxa" w:w="90"/>
+              <w:bottom w:type="dxa" w:w="50"/>
+              <w:right w:type="dxa" w:w="90"/>
+            </w:tcMar>
+          </w:tcPr>
+          <w:p>
+            <w:pPr>
+              <w:spacing w:after="0"/>
+              <w:jc w:val="left"/>
             </w:pPr>
             <w:r>
               <w:rPr>
@@ -420,23 +427,24 @@
         </w:trPr>
         <w:tc>
           <w:tcPr>
-            <w:tcW w:type="dxa" w:w="1550"/>
-            <w:tcBorders>
-              <w:top w:val="single" w:color="999999" w:sz="4"/>
-              <w:left w:val="single" w:color="999999" w:sz="4"/>
-              <w:bottom w:val="single" w:color="999999" w:sz="4"/>
-              <w:right w:val="single" w:color="999999" w:sz="4"/>
-            </w:tcBorders>
-            <w:tcMar>
-              <w:top w:type="dxa" w:w="60"/>
-              <w:left w:type="dxa" w:w="100"/>
-              <w:bottom w:type="dxa" w:w="60"/>
-              <w:right w:type="dxa" w:w="100"/>
-            </w:tcMar>
-          </w:tcPr>
-          <w:p>
-            <w:pPr>
-              <w:spacing w:after="0"/>
+            <w:tcW w:type="dxa" w:w="1209"/>
+            <w:tcBorders>
+              <w:top w:val="single" w:color="999999" w:sz="4"/>
+              <w:left w:val="single" w:color="999999" w:sz="4"/>
+              <w:bottom w:val="single" w:color="999999" w:sz="4"/>
+              <w:right w:val="single" w:color="999999" w:sz="4"/>
+            </w:tcBorders>
+            <w:tcMar>
+              <w:top w:type="dxa" w:w="50"/>
+              <w:left w:type="dxa" w:w="90"/>
+              <w:bottom w:type="dxa" w:w="50"/>
+              <w:right w:type="dxa" w:w="90"/>
+            </w:tcMar>
+          </w:tcPr>
+          <w:p>
+            <w:pPr>
+              <w:spacing w:after="0"/>
+              <w:jc w:val="left"/>
             </w:pPr>
             <w:r>
               <w:rPr>
@@ -450,23 +458,24 @@
         </w:tc>
         <w:tc>
           <w:tcPr>
-            <w:tcW w:type="dxa" w:w="1550"/>
-            <w:tcBorders>
-              <w:top w:val="single" w:color="999999" w:sz="4"/>
-              <w:left w:val="single" w:color="999999" w:sz="4"/>
-              <w:bottom w:val="single" w:color="999999" w:sz="4"/>
-              <w:right w:val="single" w:color="999999" w:sz="4"/>
-            </w:tcBorders>
-            <w:tcMar>
-              <w:top w:type="dxa" w:w="60"/>
-              <w:left w:type="dxa" w:w="100"/>
-              <w:bottom w:type="dxa" w:w="60"/>
-              <w:right w:type="dxa" w:w="100"/>
-            </w:tcMar>
-          </w:tcPr>
-          <w:p>
-            <w:pPr>
-              <w:spacing w:after="0"/>
+            <w:tcW w:type="dxa" w:w="1612"/>
+            <w:tcBorders>
+              <w:top w:val="single" w:color="999999" w:sz="4"/>
+              <w:left w:val="single" w:color="999999" w:sz="4"/>
+              <w:bottom w:val="single" w:color="999999" w:sz="4"/>
+              <w:right w:val="single" w:color="999999" w:sz="4"/>
+            </w:tcBorders>
+            <w:tcMar>
+              <w:top w:type="dxa" w:w="50"/>
+              <w:left w:type="dxa" w:w="90"/>
+              <w:bottom w:type="dxa" w:w="50"/>
+              <w:right w:type="dxa" w:w="90"/>
+            </w:tcMar>
+          </w:tcPr>
+          <w:p>
+            <w:pPr>
+              <w:spacing w:after="0"/>
+              <w:jc w:val="left"/>
             </w:pPr>
             <w:r>
               <w:rPr>
@@ -480,23 +489,24 @@
         </w:tc>
         <w:tc>
           <w:tcPr>
-            <w:tcW w:type="dxa" w:w="2132"/>
-            <w:tcBorders>
-              <w:top w:val="single" w:color="999999" w:sz="4"/>
-              <w:left w:val="single" w:color="999999" w:sz="4"/>
-              <w:bottom w:val="single" w:color="999999" w:sz="4"/>
-              <w:right w:val="single" w:color="999999" w:sz="4"/>
-            </w:tcBorders>
-            <w:tcMar>
-              <w:top w:type="dxa" w:w="60"/>
-              <w:left w:type="dxa" w:w="100"/>
-              <w:bottom w:type="dxa" w:w="60"/>
-              <w:right w:type="dxa" w:w="100"/>
-            </w:tcMar>
-          </w:tcPr>
-          <w:p>
-            <w:pPr>
-              <w:spacing w:after="0"/>
+            <w:tcW w:type="dxa" w:w="2217"/>
+            <w:tcBorders>
+              <w:top w:val="single" w:color="999999" w:sz="4"/>
+              <w:left w:val="single" w:color="999999" w:sz="4"/>
+              <w:bottom w:val="single" w:color="999999" w:sz="4"/>
+              <w:right w:val="single" w:color="999999" w:sz="4"/>
+            </w:tcBorders>
+            <w:tcMar>
+              <w:top w:type="dxa" w:w="50"/>
+              <w:left w:type="dxa" w:w="90"/>
+              <w:bottom w:type="dxa" w:w="50"/>
+              <w:right w:type="dxa" w:w="90"/>
+            </w:tcMar>
+          </w:tcPr>
+          <w:p>
+            <w:pPr>
+              <w:spacing w:after="0"/>
+              <w:jc w:val="left"/>
             </w:pPr>
             <w:r>
               <w:rPr>
@@ -510,23 +520,24 @@
         </w:tc>
         <w:tc>
           <w:tcPr>
-            <w:tcW w:type="dxa" w:w="4848"/>
-            <w:tcBorders>
-              <w:top w:val="single" w:color="999999" w:sz="4"/>
-              <w:left w:val="single" w:color="999999" w:sz="4"/>
-              <w:bottom w:val="single" w:color="999999" w:sz="4"/>
-              <w:right w:val="single" w:color="999999" w:sz="4"/>
-            </w:tcBorders>
-            <w:tcMar>
-              <w:top w:type="dxa" w:w="60"/>
-              <w:left w:type="dxa" w:w="100"/>
-              <w:bottom w:type="dxa" w:w="60"/>
-              <w:right w:type="dxa" w:w="100"/>
-            </w:tcMar>
-          </w:tcPr>
-          <w:p>
-            <w:pPr>
-              <w:spacing w:after="0"/>
+            <w:tcW w:type="dxa" w:w="5042"/>
+            <w:tcBorders>
+              <w:top w:val="single" w:color="999999" w:sz="4"/>
+              <w:left w:val="single" w:color="999999" w:sz="4"/>
+              <w:bottom w:val="single" w:color="999999" w:sz="4"/>
+              <w:right w:val="single" w:color="999999" w:sz="4"/>
+            </w:tcBorders>
+            <w:tcMar>
+              <w:top w:type="dxa" w:w="50"/>
+              <w:left w:type="dxa" w:w="90"/>
+              <w:bottom w:type="dxa" w:w="50"/>
+              <w:right w:type="dxa" w:w="90"/>
+            </w:tcMar>
+          </w:tcPr>
+          <w:p>
+            <w:pPr>
+              <w:spacing w:after="0"/>
+              <w:jc w:val="left"/>
             </w:pPr>
             <w:r>
               <w:rPr>
@@ -545,23 +556,24 @@
         </w:trPr>
         <w:tc>
           <w:tcPr>
-            <w:tcW w:type="dxa" w:w="1550"/>
-            <w:tcBorders>
-              <w:top w:val="single" w:color="999999" w:sz="4"/>
-              <w:left w:val="single" w:color="999999" w:sz="4"/>
-              <w:bottom w:val="single" w:color="999999" w:sz="4"/>
-              <w:right w:val="single" w:color="999999" w:sz="4"/>
-            </w:tcBorders>
-            <w:tcMar>
-              <w:top w:type="dxa" w:w="60"/>
-              <w:left w:type="dxa" w:w="100"/>
-              <w:bottom w:type="dxa" w:w="60"/>
-              <w:right w:type="dxa" w:w="100"/>
-            </w:tcMar>
-          </w:tcPr>
-          <w:p>
-            <w:pPr>
-              <w:spacing w:after="0"/>
+            <w:tcW w:type="dxa" w:w="1209"/>
+            <w:tcBorders>
+              <w:top w:val="single" w:color="999999" w:sz="4"/>
+              <w:left w:val="single" w:color="999999" w:sz="4"/>
+              <w:bottom w:val="single" w:color="999999" w:sz="4"/>
+              <w:right w:val="single" w:color="999999" w:sz="4"/>
+            </w:tcBorders>
+            <w:tcMar>
+              <w:top w:type="dxa" w:w="50"/>
+              <w:left w:type="dxa" w:w="90"/>
+              <w:bottom w:type="dxa" w:w="50"/>
+              <w:right w:type="dxa" w:w="90"/>
+            </w:tcMar>
+          </w:tcPr>
+          <w:p>
+            <w:pPr>
+              <w:spacing w:after="0"/>
+              <w:jc w:val="left"/>
             </w:pPr>
             <w:r>
               <w:rPr>
@@ -575,23 +587,24 @@
         </w:tc>
         <w:tc>
           <w:tcPr>
-            <w:tcW w:type="dxa" w:w="1550"/>
-            <w:tcBorders>
-              <w:top w:val="single" w:color="999999" w:sz="4"/>
-              <w:left w:val="single" w:color="999999" w:sz="4"/>
-              <w:bottom w:val="single" w:color="999999" w:sz="4"/>
-              <w:right w:val="single" w:color="999999" w:sz="4"/>
-            </w:tcBorders>
-            <w:tcMar>
-              <w:top w:type="dxa" w:w="60"/>
-              <w:left w:type="dxa" w:w="100"/>
-              <w:bottom w:type="dxa" w:w="60"/>
-              <w:right w:type="dxa" w:w="100"/>
-            </w:tcMar>
-          </w:tcPr>
-          <w:p>
-            <w:pPr>
-              <w:spacing w:after="0"/>
+            <w:tcW w:type="dxa" w:w="1612"/>
+            <w:tcBorders>
+              <w:top w:val="single" w:color="999999" w:sz="4"/>
+              <w:left w:val="single" w:color="999999" w:sz="4"/>
+              <w:bottom w:val="single" w:color="999999" w:sz="4"/>
+              <w:right w:val="single" w:color="999999" w:sz="4"/>
+            </w:tcBorders>
+            <w:tcMar>
+              <w:top w:type="dxa" w:w="50"/>
+              <w:left w:type="dxa" w:w="90"/>
+              <w:bottom w:type="dxa" w:w="50"/>
+              <w:right w:type="dxa" w:w="90"/>
+            </w:tcMar>
+          </w:tcPr>
+          <w:p>
+            <w:pPr>
+              <w:spacing w:after="0"/>
+              <w:jc w:val="left"/>
             </w:pPr>
             <w:r>
               <w:rPr>
@@ -605,23 +618,24 @@
         </w:tc>
         <w:tc>
           <w:tcPr>
-            <w:tcW w:type="dxa" w:w="2132"/>
-            <w:tcBorders>
-              <w:top w:val="single" w:color="999999" w:sz="4"/>
-              <w:left w:val="single" w:color="999999" w:sz="4"/>
-              <w:bottom w:val="single" w:color="999999" w:sz="4"/>
-              <w:right w:val="single" w:color="999999" w:sz="4"/>
-            </w:tcBorders>
-            <w:tcMar>
-              <w:top w:type="dxa" w:w="60"/>
-              <w:left w:type="dxa" w:w="100"/>
-              <w:bottom w:type="dxa" w:w="60"/>
-              <w:right w:type="dxa" w:w="100"/>
-            </w:tcMar>
-          </w:tcPr>
-          <w:p>
-            <w:pPr>
-              <w:spacing w:after="0"/>
+            <w:tcW w:type="dxa" w:w="2217"/>
+            <w:tcBorders>
+              <w:top w:val="single" w:color="999999" w:sz="4"/>
+              <w:left w:val="single" w:color="999999" w:sz="4"/>
+              <w:bottom w:val="single" w:color="999999" w:sz="4"/>
+              <w:right w:val="single" w:color="999999" w:sz="4"/>
+            </w:tcBorders>
+            <w:tcMar>
+              <w:top w:type="dxa" w:w="50"/>
+              <w:left w:type="dxa" w:w="90"/>
+              <w:bottom w:type="dxa" w:w="50"/>
+              <w:right w:type="dxa" w:w="90"/>
+            </w:tcMar>
+          </w:tcPr>
+          <w:p>
+            <w:pPr>
+              <w:spacing w:after="0"/>
+              <w:jc w:val="left"/>
             </w:pPr>
             <w:r>
               <w:rPr>
@@ -635,23 +649,24 @@
         </w:tc>
         <w:tc>
           <w:tcPr>
-            <w:tcW w:type="dxa" w:w="4848"/>
-            <w:tcBorders>
-              <w:top w:val="single" w:color="999999" w:sz="4"/>
-              <w:left w:val="single" w:color="999999" w:sz="4"/>
-              <w:bottom w:val="single" w:color="999999" w:sz="4"/>
-              <w:right w:val="single" w:color="999999" w:sz="4"/>
-            </w:tcBorders>
-            <w:tcMar>
-              <w:top w:type="dxa" w:w="60"/>
-              <w:left w:type="dxa" w:w="100"/>
-              <w:bottom w:type="dxa" w:w="60"/>
-              <w:right w:type="dxa" w:w="100"/>
-            </w:tcMar>
-          </w:tcPr>
-          <w:p>
-            <w:pPr>
-              <w:spacing w:after="0"/>
+            <w:tcW w:type="dxa" w:w="5042"/>
+            <w:tcBorders>
+              <w:top w:val="single" w:color="999999" w:sz="4"/>
+              <w:left w:val="single" w:color="999999" w:sz="4"/>
+              <w:bottom w:val="single" w:color="999999" w:sz="4"/>
+              <w:right w:val="single" w:color="999999" w:sz="4"/>
+            </w:tcBorders>
+            <w:tcMar>
+              <w:top w:type="dxa" w:w="50"/>
+              <w:left w:type="dxa" w:w="90"/>
+              <w:bottom w:type="dxa" w:w="50"/>
+              <w:right w:type="dxa" w:w="90"/>
+            </w:tcMar>
+          </w:tcPr>
+          <w:p>
+            <w:pPr>
+              <w:spacing w:after="0"/>
+              <w:jc w:val="left"/>
             </w:pPr>
             <w:r>
               <w:rPr>
@@ -845,15 +860,16 @@
             </w:tcBorders>
             <w:shd w:fill="DCE6F1" w:color="auto" w:val="clear"/>
             <w:tcMar>
-              <w:top w:type="dxa" w:w="60"/>
-              <w:left w:type="dxa" w:w="100"/>
-              <w:bottom w:type="dxa" w:w="60"/>
-              <w:right w:type="dxa" w:w="100"/>
-            </w:tcMar>
-          </w:tcPr>
-          <w:p>
-            <w:pPr>
-              <w:spacing w:after="0"/>
+              <w:top w:type="dxa" w:w="50"/>
+              <w:left w:type="dxa" w:w="90"/>
+              <w:bottom w:type="dxa" w:w="50"/>
+              <w:right w:type="dxa" w:w="90"/>
+            </w:tcMar>
+          </w:tcPr>
+          <w:p>
+            <w:pPr>
+              <w:spacing w:after="0"/>
+              <w:jc w:val="left"/>
             </w:pPr>
             <w:r>
               <w:rPr>
@@ -878,15 +894,16 @@
             </w:tcBorders>
             <w:shd w:fill="DCE6F1" w:color="auto" w:val="clear"/>
             <w:tcMar>
-              <w:top w:type="dxa" w:w="60"/>
-              <w:left w:type="dxa" w:w="100"/>
-              <w:bottom w:type="dxa" w:w="60"/>
-              <w:right w:type="dxa" w:w="100"/>
-            </w:tcMar>
-          </w:tcPr>
-          <w:p>
-            <w:pPr>
-              <w:spacing w:after="0"/>
+              <w:top w:type="dxa" w:w="50"/>
+              <w:left w:type="dxa" w:w="90"/>
+              <w:bottom w:type="dxa" w:w="50"/>
+              <w:right w:type="dxa" w:w="90"/>
+            </w:tcMar>
+          </w:tcPr>
+          <w:p>
+            <w:pPr>
+              <w:spacing w:after="0"/>
+              <w:jc w:val="left"/>
             </w:pPr>
             <w:r>
               <w:rPr>
@@ -911,15 +928,16 @@
             </w:tcBorders>
             <w:shd w:fill="DCE6F1" w:color="auto" w:val="clear"/>
             <w:tcMar>
-              <w:top w:type="dxa" w:w="60"/>
-              <w:left w:type="dxa" w:w="100"/>
-              <w:bottom w:type="dxa" w:w="60"/>
-              <w:right w:type="dxa" w:w="100"/>
-            </w:tcMar>
-          </w:tcPr>
-          <w:p>
-            <w:pPr>
-              <w:spacing w:after="0"/>
+              <w:top w:type="dxa" w:w="50"/>
+              <w:left w:type="dxa" w:w="90"/>
+              <w:bottom w:type="dxa" w:w="50"/>
+              <w:right w:type="dxa" w:w="90"/>
+            </w:tcMar>
+          </w:tcPr>
+          <w:p>
+            <w:pPr>
+              <w:spacing w:after="0"/>
+              <w:jc w:val="left"/>
             </w:pPr>
             <w:r>
               <w:rPr>
@@ -948,15 +966,16 @@
               <w:right w:val="single" w:color="999999" w:sz="4"/>
             </w:tcBorders>
             <w:tcMar>
-              <w:top w:type="dxa" w:w="60"/>
-              <w:left w:type="dxa" w:w="100"/>
-              <w:bottom w:type="dxa" w:w="60"/>
-              <w:right w:type="dxa" w:w="100"/>
-            </w:tcMar>
-          </w:tcPr>
-          <w:p>
-            <w:pPr>
-              <w:spacing w:after="0"/>
+              <w:top w:type="dxa" w:w="50"/>
+              <w:left w:type="dxa" w:w="90"/>
+              <w:bottom w:type="dxa" w:w="50"/>
+              <w:right w:type="dxa" w:w="90"/>
+            </w:tcMar>
+          </w:tcPr>
+          <w:p>
+            <w:pPr>
+              <w:spacing w:after="0"/>
+              <w:jc w:val="left"/>
             </w:pPr>
             <w:r>
               <w:rPr>
@@ -978,15 +997,16 @@
               <w:right w:val="single" w:color="999999" w:sz="4"/>
             </w:tcBorders>
             <w:tcMar>
-              <w:top w:type="dxa" w:w="60"/>
-              <w:left w:type="dxa" w:w="100"/>
-              <w:bottom w:type="dxa" w:w="60"/>
-              <w:right w:type="dxa" w:w="100"/>
-            </w:tcMar>
-          </w:tcPr>
-          <w:p>
-            <w:pPr>
-              <w:spacing w:after="0"/>
+              <w:top w:type="dxa" w:w="50"/>
+              <w:left w:type="dxa" w:w="90"/>
+              <w:bottom w:type="dxa" w:w="50"/>
+              <w:right w:type="dxa" w:w="90"/>
+            </w:tcMar>
+          </w:tcPr>
+          <w:p>
+            <w:pPr>
+              <w:spacing w:after="0"/>
+              <w:jc w:val="left"/>
             </w:pPr>
             <w:r>
               <w:rPr>
@@ -1008,15 +1028,16 @@
               <w:right w:val="single" w:color="999999" w:sz="4"/>
             </w:tcBorders>
             <w:tcMar>
-              <w:top w:type="dxa" w:w="60"/>
-              <w:left w:type="dxa" w:w="100"/>
-              <w:bottom w:type="dxa" w:w="60"/>
-              <w:right w:type="dxa" w:w="100"/>
-            </w:tcMar>
-          </w:tcPr>
-          <w:p>
-            <w:pPr>
-              <w:spacing w:after="0"/>
+              <w:top w:type="dxa" w:w="50"/>
+              <w:left w:type="dxa" w:w="90"/>
+              <w:bottom w:type="dxa" w:w="50"/>
+              <w:right w:type="dxa" w:w="90"/>
+            </w:tcMar>
+          </w:tcPr>
+          <w:p>
+            <w:pPr>
+              <w:spacing w:after="0"/>
+              <w:jc w:val="left"/>
             </w:pPr>
             <w:r>
               <w:rPr>
@@ -1043,15 +1064,16 @@
               <w:right w:val="single" w:color="999999" w:sz="4"/>
             </w:tcBorders>
             <w:tcMar>
-              <w:top w:type="dxa" w:w="60"/>
-              <w:left w:type="dxa" w:w="100"/>
-              <w:bottom w:type="dxa" w:w="60"/>
-              <w:right w:type="dxa" w:w="100"/>
-            </w:tcMar>
-          </w:tcPr>
-          <w:p>
-            <w:pPr>
-              <w:spacing w:after="0"/>
+              <w:top w:type="dxa" w:w="50"/>
+              <w:left w:type="dxa" w:w="90"/>
+              <w:bottom w:type="dxa" w:w="50"/>
+              <w:right w:type="dxa" w:w="90"/>
+            </w:tcMar>
+          </w:tcPr>
+          <w:p>
+            <w:pPr>
+              <w:spacing w:after="0"/>
+              <w:jc w:val="left"/>
             </w:pPr>
             <w:r>
               <w:rPr>
@@ -1073,15 +1095,16 @@
               <w:right w:val="single" w:color="999999" w:sz="4"/>
             </w:tcBorders>
             <w:tcMar>
-              <w:top w:type="dxa" w:w="60"/>
-              <w:left w:type="dxa" w:w="100"/>
-              <w:bottom w:type="dxa" w:w="60"/>
-              <w:right w:type="dxa" w:w="100"/>
-            </w:tcMar>
-          </w:tcPr>
-          <w:p>
-            <w:pPr>
-              <w:spacing w:after="0"/>
+              <w:top w:type="dxa" w:w="50"/>
+              <w:left w:type="dxa" w:w="90"/>
+              <w:bottom w:type="dxa" w:w="50"/>
+              <w:right w:type="dxa" w:w="90"/>
+            </w:tcMar>
+          </w:tcPr>
+          <w:p>
+            <w:pPr>
+              <w:spacing w:after="0"/>
+              <w:jc w:val="left"/>
             </w:pPr>
             <w:r>
               <w:rPr>
@@ -1103,15 +1126,16 @@
               <w:right w:val="single" w:color="999999" w:sz="4"/>
             </w:tcBorders>
             <w:tcMar>
-              <w:top w:type="dxa" w:w="60"/>
-              <w:left w:type="dxa" w:w="100"/>
-              <w:bottom w:type="dxa" w:w="60"/>
-              <w:right w:type="dxa" w:w="100"/>
-            </w:tcMar>
-          </w:tcPr>
-          <w:p>
-            <w:pPr>
-              <w:spacing w:after="0"/>
+              <w:top w:type="dxa" w:w="50"/>
+              <w:left w:type="dxa" w:w="90"/>
+              <w:bottom w:type="dxa" w:w="50"/>
+              <w:right w:type="dxa" w:w="90"/>
+            </w:tcMar>
+          </w:tcPr>
+          <w:p>
+            <w:pPr>
+              <w:spacing w:after="0"/>
+              <w:jc w:val="left"/>
             </w:pPr>
             <w:r>
               <w:rPr>
@@ -1138,15 +1162,16 @@
               <w:right w:val="single" w:color="999999" w:sz="4"/>
             </w:tcBorders>
             <w:tcMar>
-              <w:top w:type="dxa" w:w="60"/>
-              <w:left w:type="dxa" w:w="100"/>
-              <w:bottom w:type="dxa" w:w="60"/>
-              <w:right w:type="dxa" w:w="100"/>
-            </w:tcMar>
-          </w:tcPr>
-          <w:p>
-            <w:pPr>
-              <w:spacing w:after="0"/>
+              <w:top w:type="dxa" w:w="50"/>
+              <w:left w:type="dxa" w:w="90"/>
+              <w:bottom w:type="dxa" w:w="50"/>
+              <w:right w:type="dxa" w:w="90"/>
+            </w:tcMar>
+          </w:tcPr>
+          <w:p>
+            <w:pPr>
+              <w:spacing w:after="0"/>
+              <w:jc w:val="left"/>
             </w:pPr>
             <w:r>
               <w:rPr>
@@ -1168,15 +1193,16 @@
               <w:right w:val="single" w:color="999999" w:sz="4"/>
             </w:tcBorders>
             <w:tcMar>
-              <w:top w:type="dxa" w:w="60"/>
-              <w:left w:type="dxa" w:w="100"/>
-              <w:bottom w:type="dxa" w:w="60"/>
-              <w:right w:type="dxa" w:w="100"/>
-            </w:tcMar>
-          </w:tcPr>
-          <w:p>
-            <w:pPr>
-              <w:spacing w:after="0"/>
+              <w:top w:type="dxa" w:w="50"/>
+              <w:left w:type="dxa" w:w="90"/>
+              <w:bottom w:type="dxa" w:w="50"/>
+              <w:right w:type="dxa" w:w="90"/>
+            </w:tcMar>
+          </w:tcPr>
+          <w:p>
+            <w:pPr>
+              <w:spacing w:after="0"/>
+              <w:jc w:val="left"/>
             </w:pPr>
             <w:r>
               <w:rPr>
@@ -1198,15 +1224,16 @@
               <w:right w:val="single" w:color="999999" w:sz="4"/>
             </w:tcBorders>
             <w:tcMar>
-              <w:top w:type="dxa" w:w="60"/>
-              <w:left w:type="dxa" w:w="100"/>
-              <w:bottom w:type="dxa" w:w="60"/>
-              <w:right w:type="dxa" w:w="100"/>
-            </w:tcMar>
-          </w:tcPr>
-          <w:p>
-            <w:pPr>
-              <w:spacing w:after="0"/>
+              <w:top w:type="dxa" w:w="50"/>
+              <w:left w:type="dxa" w:w="90"/>
+              <w:bottom w:type="dxa" w:w="50"/>
+              <w:right w:type="dxa" w:w="90"/>
+            </w:tcMar>
+          </w:tcPr>
+          <w:p>
+            <w:pPr>
+              <w:spacing w:after="0"/>
+              <w:jc w:val="left"/>
             </w:pPr>
             <w:r>
               <w:rPr>
@@ -2645,15 +2672,16 @@
             </w:tcBorders>
             <w:shd w:fill="DCE6F1" w:color="auto" w:val="clear"/>
             <w:tcMar>
-              <w:top w:type="dxa" w:w="60"/>
-              <w:left w:type="dxa" w:w="100"/>
-              <w:bottom w:type="dxa" w:w="60"/>
-              <w:right w:type="dxa" w:w="100"/>
-            </w:tcMar>
-          </w:tcPr>
-          <w:p>
-            <w:pPr>
-              <w:spacing w:after="0"/>
+              <w:top w:type="dxa" w:w="50"/>
+              <w:left w:type="dxa" w:w="90"/>
+              <w:bottom w:type="dxa" w:w="50"/>
+              <w:right w:type="dxa" w:w="90"/>
+            </w:tcMar>
+          </w:tcPr>
+          <w:p>
+            <w:pPr>
+              <w:spacing w:after="0"/>
+              <w:jc w:val="left"/>
             </w:pPr>
             <w:r>
               <w:rPr>
@@ -2678,15 +2706,16 @@
             </w:tcBorders>
             <w:shd w:fill="DCE6F1" w:color="auto" w:val="clear"/>
             <w:tcMar>
-              <w:top w:type="dxa" w:w="60"/>
-              <w:left w:type="dxa" w:w="100"/>
-              <w:bottom w:type="dxa" w:w="60"/>
-              <w:right w:type="dxa" w:w="100"/>
-            </w:tcMar>
-          </w:tcPr>
-          <w:p>
-            <w:pPr>
-              <w:spacing w:after="0"/>
+              <w:top w:type="dxa" w:w="50"/>
+              <w:left w:type="dxa" w:w="90"/>
+              <w:bottom w:type="dxa" w:w="50"/>
+              <w:right w:type="dxa" w:w="90"/>
+            </w:tcMar>
+          </w:tcPr>
+          <w:p>
+            <w:pPr>
+              <w:spacing w:after="0"/>
+              <w:jc w:val="left"/>
             </w:pPr>
             <w:r>
               <w:rPr>
@@ -2711,15 +2740,16 @@
             </w:tcBorders>
             <w:shd w:fill="DCE6F1" w:color="auto" w:val="clear"/>
             <w:tcMar>
-              <w:top w:type="dxa" w:w="60"/>
-              <w:left w:type="dxa" w:w="100"/>
-              <w:bottom w:type="dxa" w:w="60"/>
-              <w:right w:type="dxa" w:w="100"/>
-            </w:tcMar>
-          </w:tcPr>
-          <w:p>
-            <w:pPr>
-              <w:spacing w:after="0"/>
+              <w:top w:type="dxa" w:w="50"/>
+              <w:left w:type="dxa" w:w="90"/>
+              <w:bottom w:type="dxa" w:w="50"/>
+              <w:right w:type="dxa" w:w="90"/>
+            </w:tcMar>
+          </w:tcPr>
+          <w:p>
+            <w:pPr>
+              <w:spacing w:after="0"/>
+              <w:jc w:val="left"/>
             </w:pPr>
             <w:r>
               <w:rPr>
@@ -2748,15 +2778,16 @@
               <w:right w:val="single" w:color="999999" w:sz="4"/>
             </w:tcBorders>
             <w:tcMar>
-              <w:top w:type="dxa" w:w="60"/>
-              <w:left w:type="dxa" w:w="100"/>
-              <w:bottom w:type="dxa" w:w="60"/>
-              <w:right w:type="dxa" w:w="100"/>
-            </w:tcMar>
-          </w:tcPr>
-          <w:p>
-            <w:pPr>
-              <w:spacing w:after="0"/>
+              <w:top w:type="dxa" w:w="50"/>
+              <w:left w:type="dxa" w:w="90"/>
+              <w:bottom w:type="dxa" w:w="50"/>
+              <w:right w:type="dxa" w:w="90"/>
+            </w:tcMar>
+          </w:tcPr>
+          <w:p>
+            <w:pPr>
+              <w:spacing w:after="0"/>
+              <w:jc w:val="left"/>
             </w:pPr>
             <w:r>
               <w:rPr>
@@ -2778,15 +2809,16 @@
               <w:right w:val="single" w:color="999999" w:sz="4"/>
             </w:tcBorders>
             <w:tcMar>
-              <w:top w:type="dxa" w:w="60"/>
-              <w:left w:type="dxa" w:w="100"/>
-              <w:bottom w:type="dxa" w:w="60"/>
-              <w:right w:type="dxa" w:w="100"/>
-            </w:tcMar>
-          </w:tcPr>
-          <w:p>
-            <w:pPr>
-              <w:spacing w:after="0"/>
+              <w:top w:type="dxa" w:w="50"/>
+              <w:left w:type="dxa" w:w="90"/>
+              <w:bottom w:type="dxa" w:w="50"/>
+              <w:right w:type="dxa" w:w="90"/>
+            </w:tcMar>
+          </w:tcPr>
+          <w:p>
+            <w:pPr>
+              <w:spacing w:after="0"/>
+              <w:jc w:val="left"/>
             </w:pPr>
             <w:r>
               <w:rPr>
@@ -2808,15 +2840,16 @@
               <w:right w:val="single" w:color="999999" w:sz="4"/>
             </w:tcBorders>
             <w:tcMar>
-              <w:top w:type="dxa" w:w="60"/>
-              <w:left w:type="dxa" w:w="100"/>
-              <w:bottom w:type="dxa" w:w="60"/>
-              <w:right w:type="dxa" w:w="100"/>
-            </w:tcMar>
-          </w:tcPr>
-          <w:p>
-            <w:pPr>
-              <w:spacing w:after="0"/>
+              <w:top w:type="dxa" w:w="50"/>
+              <w:left w:type="dxa" w:w="90"/>
+              <w:bottom w:type="dxa" w:w="50"/>
+              <w:right w:type="dxa" w:w="90"/>
+            </w:tcMar>
+          </w:tcPr>
+          <w:p>
+            <w:pPr>
+              <w:spacing w:after="0"/>
+              <w:jc w:val="left"/>
             </w:pPr>
             <w:r>
               <w:rPr>
@@ -2843,15 +2876,16 @@
               <w:right w:val="single" w:color="999999" w:sz="4"/>
             </w:tcBorders>
             <w:tcMar>
-              <w:top w:type="dxa" w:w="60"/>
-              <w:left w:type="dxa" w:w="100"/>
-              <w:bottom w:type="dxa" w:w="60"/>
-              <w:right w:type="dxa" w:w="100"/>
-            </w:tcMar>
-          </w:tcPr>
-          <w:p>
-            <w:pPr>
-              <w:spacing w:after="0"/>
+              <w:top w:type="dxa" w:w="50"/>
+              <w:left w:type="dxa" w:w="90"/>
+              <w:bottom w:type="dxa" w:w="50"/>
+              <w:right w:type="dxa" w:w="90"/>
+            </w:tcMar>
+          </w:tcPr>
+          <w:p>
+            <w:pPr>
+              <w:spacing w:after="0"/>
+              <w:jc w:val="left"/>
             </w:pPr>
             <w:r>
               <w:rPr>
@@ -2873,15 +2907,16 @@
               <w:right w:val="single" w:color="999999" w:sz="4"/>
             </w:tcBorders>
             <w:tcMar>
-              <w:top w:type="dxa" w:w="60"/>
-              <w:left w:type="dxa" w:w="100"/>
-              <w:bottom w:type="dxa" w:w="60"/>
-              <w:right w:type="dxa" w:w="100"/>
-            </w:tcMar>
-          </w:tcPr>
-          <w:p>
-            <w:pPr>
-              <w:spacing w:after="0"/>
+              <w:top w:type="dxa" w:w="50"/>
+              <w:left w:type="dxa" w:w="90"/>
+              <w:bottom w:type="dxa" w:w="50"/>
+              <w:right w:type="dxa" w:w="90"/>
+            </w:tcMar>
+          </w:tcPr>
+          <w:p>
+            <w:pPr>
+              <w:spacing w:after="0"/>
+              <w:jc w:val="left"/>
             </w:pPr>
             <w:r>
               <w:rPr>
@@ -2903,15 +2938,16 @@
               <w:right w:val="single" w:color="999999" w:sz="4"/>
             </w:tcBorders>
             <w:tcMar>
-              <w:top w:type="dxa" w:w="60"/>
-              <w:left w:type="dxa" w:w="100"/>
-              <w:bottom w:type="dxa" w:w="60"/>
-              <w:right w:type="dxa" w:w="100"/>
-            </w:tcMar>
-          </w:tcPr>
-          <w:p>
-            <w:pPr>
-              <w:spacing w:after="0"/>
+              <w:top w:type="dxa" w:w="50"/>
+              <w:left w:type="dxa" w:w="90"/>
+              <w:bottom w:type="dxa" w:w="50"/>
+              <w:right w:type="dxa" w:w="90"/>
+            </w:tcMar>
+          </w:tcPr>
+          <w:p>
+            <w:pPr>
+              <w:spacing w:after="0"/>
+              <w:jc w:val="left"/>
             </w:pPr>
             <w:r>
               <w:rPr>
@@ -2938,15 +2974,16 @@
               <w:right w:val="single" w:color="999999" w:sz="4"/>
             </w:tcBorders>
             <w:tcMar>
-              <w:top w:type="dxa" w:w="60"/>
-              <w:left w:type="dxa" w:w="100"/>
-              <w:bottom w:type="dxa" w:w="60"/>
-              <w:right w:type="dxa" w:w="100"/>
-            </w:tcMar>
-          </w:tcPr>
-          <w:p>
-            <w:pPr>
-              <w:spacing w:after="0"/>
+              <w:top w:type="dxa" w:w="50"/>
+              <w:left w:type="dxa" w:w="90"/>
+              <w:bottom w:type="dxa" w:w="50"/>
+              <w:right w:type="dxa" w:w="90"/>
+            </w:tcMar>
+          </w:tcPr>
+          <w:p>
+            <w:pPr>
+              <w:spacing w:after="0"/>
+              <w:jc w:val="left"/>
             </w:pPr>
             <w:r>
               <w:rPr>
@@ -2968,15 +3005,16 @@
               <w:right w:val="single" w:color="999999" w:sz="4"/>
             </w:tcBorders>
             <w:tcMar>
-              <w:top w:type="dxa" w:w="60"/>
-              <w:left w:type="dxa" w:w="100"/>
-              <w:bottom w:type="dxa" w:w="60"/>
-              <w:right w:type="dxa" w:w="100"/>
-            </w:tcMar>
-          </w:tcPr>
-          <w:p>
-            <w:pPr>
-              <w:spacing w:after="0"/>
+              <w:top w:type="dxa" w:w="50"/>
+              <w:left w:type="dxa" w:w="90"/>
+              <w:bottom w:type="dxa" w:w="50"/>
+              <w:right w:type="dxa" w:w="90"/>
+            </w:tcMar>
+          </w:tcPr>
+          <w:p>
+            <w:pPr>
+              <w:spacing w:after="0"/>
+              <w:jc w:val="left"/>
             </w:pPr>
             <w:r>
               <w:rPr>
@@ -2998,15 +3036,16 @@
               <w:right w:val="single" w:color="999999" w:sz="4"/>
             </w:tcBorders>
             <w:tcMar>
-              <w:top w:type="dxa" w:w="60"/>
-              <w:left w:type="dxa" w:w="100"/>
-              <w:bottom w:type="dxa" w:w="60"/>
-              <w:right w:type="dxa" w:w="100"/>
-            </w:tcMar>
-          </w:tcPr>
-          <w:p>
-            <w:pPr>
-              <w:spacing w:after="0"/>
+              <w:top w:type="dxa" w:w="50"/>
+              <w:left w:type="dxa" w:w="90"/>
+              <w:bottom w:type="dxa" w:w="50"/>
+              <w:right w:type="dxa" w:w="90"/>
+            </w:tcMar>
+          </w:tcPr>
+          <w:p>
+            <w:pPr>
+              <w:spacing w:after="0"/>
+              <w:jc w:val="left"/>
             </w:pPr>
             <w:r>
               <w:rPr>
@@ -3290,15 +3329,16 @@
             </w:tcBorders>
             <w:shd w:fill="DCE6F1" w:color="auto" w:val="clear"/>
             <w:tcMar>
-              <w:top w:type="dxa" w:w="60"/>
-              <w:left w:type="dxa" w:w="100"/>
-              <w:bottom w:type="dxa" w:w="60"/>
-              <w:right w:type="dxa" w:w="100"/>
-            </w:tcMar>
-          </w:tcPr>
-          <w:p>
-            <w:pPr>
-              <w:spacing w:after="0"/>
+              <w:top w:type="dxa" w:w="50"/>
+              <w:left w:type="dxa" w:w="90"/>
+              <w:bottom w:type="dxa" w:w="50"/>
+              <w:right w:type="dxa" w:w="90"/>
+            </w:tcMar>
+          </w:tcPr>
+          <w:p>
+            <w:pPr>
+              <w:spacing w:after="0"/>
+              <w:jc w:val="left"/>
             </w:pPr>
             <w:r>
               <w:rPr>
@@ -3323,15 +3363,16 @@
             </w:tcBorders>
             <w:shd w:fill="DCE6F1" w:color="auto" w:val="clear"/>
             <w:tcMar>
-              <w:top w:type="dxa" w:w="60"/>
-              <w:left w:type="dxa" w:w="100"/>
-              <w:bottom w:type="dxa" w:w="60"/>
-              <w:right w:type="dxa" w:w="100"/>
-            </w:tcMar>
-          </w:tcPr>
-          <w:p>
-            <w:pPr>
-              <w:spacing w:after="0"/>
+              <w:top w:type="dxa" w:w="50"/>
+              <w:left w:type="dxa" w:w="90"/>
+              <w:bottom w:type="dxa" w:w="50"/>
+              <w:right w:type="dxa" w:w="90"/>
+            </w:tcMar>
+          </w:tcPr>
+          <w:p>
+            <w:pPr>
+              <w:spacing w:after="0"/>
+              <w:jc w:val="left"/>
             </w:pPr>
             <w:r>
               <w:rPr>
@@ -3356,15 +3397,16 @@
             </w:tcBorders>
             <w:shd w:fill="DCE6F1" w:color="auto" w:val="clear"/>
             <w:tcMar>
-              <w:top w:type="dxa" w:w="60"/>
-              <w:left w:type="dxa" w:w="100"/>
-              <w:bottom w:type="dxa" w:w="60"/>
-              <w:right w:type="dxa" w:w="100"/>
-            </w:tcMar>
-          </w:tcPr>
-          <w:p>
-            <w:pPr>
-              <w:spacing w:after="0"/>
+              <w:top w:type="dxa" w:w="50"/>
+              <w:left w:type="dxa" w:w="90"/>
+              <w:bottom w:type="dxa" w:w="50"/>
+              <w:right w:type="dxa" w:w="90"/>
+            </w:tcMar>
+          </w:tcPr>
+          <w:p>
+            <w:pPr>
+              <w:spacing w:after="0"/>
+              <w:jc w:val="left"/>
             </w:pPr>
             <w:r>
               <w:rPr>
@@ -3393,15 +3435,16 @@
               <w:right w:val="single" w:color="999999" w:sz="4"/>
             </w:tcBorders>
             <w:tcMar>
-              <w:top w:type="dxa" w:w="60"/>
-              <w:left w:type="dxa" w:w="100"/>
-              <w:bottom w:type="dxa" w:w="60"/>
-              <w:right w:type="dxa" w:w="100"/>
-            </w:tcMar>
-          </w:tcPr>
-          <w:p>
-            <w:pPr>
-              <w:spacing w:after="0"/>
+              <w:top w:type="dxa" w:w="50"/>
+              <w:left w:type="dxa" w:w="90"/>
+              <w:bottom w:type="dxa" w:w="50"/>
+              <w:right w:type="dxa" w:w="90"/>
+            </w:tcMar>
+          </w:tcPr>
+          <w:p>
+            <w:pPr>
+              <w:spacing w:after="0"/>
+              <w:jc w:val="left"/>
             </w:pPr>
             <w:r>
               <w:rPr>
@@ -3423,15 +3466,16 @@
               <w:right w:val="single" w:color="999999" w:sz="4"/>
             </w:tcBorders>
             <w:tcMar>
-              <w:top w:type="dxa" w:w="60"/>
-              <w:left w:type="dxa" w:w="100"/>
-              <w:bottom w:type="dxa" w:w="60"/>
-              <w:right w:type="dxa" w:w="100"/>
-            </w:tcMar>
-          </w:tcPr>
-          <w:p>
-            <w:pPr>
-              <w:spacing w:after="0"/>
+              <w:top w:type="dxa" w:w="50"/>
+              <w:left w:type="dxa" w:w="90"/>
+              <w:bottom w:type="dxa" w:w="50"/>
+              <w:right w:type="dxa" w:w="90"/>
+            </w:tcMar>
+          </w:tcPr>
+          <w:p>
+            <w:pPr>
+              <w:spacing w:after="0"/>
+              <w:jc w:val="left"/>
             </w:pPr>
             <w:r>
               <w:rPr>
@@ -3453,15 +3497,16 @@
               <w:right w:val="single" w:color="999999" w:sz="4"/>
             </w:tcBorders>
             <w:tcMar>
-              <w:top w:type="dxa" w:w="60"/>
-              <w:left w:type="dxa" w:w="100"/>
-              <w:bottom w:type="dxa" w:w="60"/>
-              <w:right w:type="dxa" w:w="100"/>
-            </w:tcMar>
-          </w:tcPr>
-          <w:p>
-            <w:pPr>
-              <w:spacing w:after="0"/>
+              <w:top w:type="dxa" w:w="50"/>
+              <w:left w:type="dxa" w:w="90"/>
+              <w:bottom w:type="dxa" w:w="50"/>
+              <w:right w:type="dxa" w:w="90"/>
+            </w:tcMar>
+          </w:tcPr>
+          <w:p>
+            <w:pPr>
+              <w:spacing w:after="0"/>
+              <w:jc w:val="left"/>
             </w:pPr>
             <w:r>
               <w:rPr>
@@ -3488,15 +3533,16 @@
               <w:right w:val="single" w:color="999999" w:sz="4"/>
             </w:tcBorders>
             <w:tcMar>
-              <w:top w:type="dxa" w:w="60"/>
-              <w:left w:type="dxa" w:w="100"/>
-              <w:bottom w:type="dxa" w:w="60"/>
-              <w:right w:type="dxa" w:w="100"/>
-            </w:tcMar>
-          </w:tcPr>
-          <w:p>
-            <w:pPr>
-              <w:spacing w:after="0"/>
+              <w:top w:type="dxa" w:w="50"/>
+              <w:left w:type="dxa" w:w="90"/>
+              <w:bottom w:type="dxa" w:w="50"/>
+              <w:right w:type="dxa" w:w="90"/>
+            </w:tcMar>
+          </w:tcPr>
+          <w:p>
+            <w:pPr>
+              <w:spacing w:after="0"/>
+              <w:jc w:val="left"/>
             </w:pPr>
             <w:r>
               <w:rPr>
@@ -3518,15 +3564,16 @@
               <w:right w:val="single" w:color="999999" w:sz="4"/>
             </w:tcBorders>
             <w:tcMar>
-              <w:top w:type="dxa" w:w="60"/>
-              <w:left w:type="dxa" w:w="100"/>
-              <w:bottom w:type="dxa" w:w="60"/>
-              <w:right w:type="dxa" w:w="100"/>
-            </w:tcMar>
-          </w:tcPr>
-          <w:p>
-            <w:pPr>
-              <w:spacing w:after="0"/>
+              <w:top w:type="dxa" w:w="50"/>
+              <w:left w:type="dxa" w:w="90"/>
+              <w:bottom w:type="dxa" w:w="50"/>
+              <w:right w:type="dxa" w:w="90"/>
+            </w:tcMar>
+          </w:tcPr>
+          <w:p>
+            <w:pPr>
+              <w:spacing w:after="0"/>
+              <w:jc w:val="left"/>
             </w:pPr>
             <w:r>
               <w:rPr>
@@ -3548,15 +3595,16 @@
               <w:right w:val="single" w:color="999999" w:sz="4"/>
             </w:tcBorders>
             <w:tcMar>
-              <w:top w:type="dxa" w:w="60"/>
-              <w:left w:type="dxa" w:w="100"/>
-              <w:bottom w:type="dxa" w:w="60"/>
-              <w:right w:type="dxa" w:w="100"/>
-            </w:tcMar>
-          </w:tcPr>
-          <w:p>
-            <w:pPr>
-              <w:spacing w:after="0"/>
+              <w:top w:type="dxa" w:w="50"/>
+              <w:left w:type="dxa" w:w="90"/>
+              <w:bottom w:type="dxa" w:w="50"/>
+              <w:right w:type="dxa" w:w="90"/>
+            </w:tcMar>
+          </w:tcPr>
+          <w:p>
+            <w:pPr>
+              <w:spacing w:after="0"/>
+              <w:jc w:val="left"/>
             </w:pPr>
             <w:r>
               <w:rPr>
@@ -3583,15 +3631,16 @@
               <w:right w:val="single" w:color="999999" w:sz="4"/>
             </w:tcBorders>
             <w:tcMar>
-              <w:top w:type="dxa" w:w="60"/>
-              <w:left w:type="dxa" w:w="100"/>
-              <w:bottom w:type="dxa" w:w="60"/>
-              <w:right w:type="dxa" w:w="100"/>
-            </w:tcMar>
-          </w:tcPr>
-          <w:p>
-            <w:pPr>
-              <w:spacing w:after="0"/>
+              <w:top w:type="dxa" w:w="50"/>
+              <w:left w:type="dxa" w:w="90"/>
+              <w:bottom w:type="dxa" w:w="50"/>
+              <w:right w:type="dxa" w:w="90"/>
+            </w:tcMar>
+          </w:tcPr>
+          <w:p>
+            <w:pPr>
+              <w:spacing w:after="0"/>
+              <w:jc w:val="left"/>
             </w:pPr>
             <w:r>
               <w:rPr>
@@ -3613,15 +3662,16 @@
               <w:right w:val="single" w:color="999999" w:sz="4"/>
             </w:tcBorders>
             <w:tcMar>
-              <w:top w:type="dxa" w:w="60"/>
-              <w:left w:type="dxa" w:w="100"/>
-              <w:bottom w:type="dxa" w:w="60"/>
-              <w:right w:type="dxa" w:w="100"/>
-            </w:tcMar>
-          </w:tcPr>
-          <w:p>
-            <w:pPr>
-              <w:spacing w:after="0"/>
+              <w:top w:type="dxa" w:w="50"/>
+              <w:left w:type="dxa" w:w="90"/>
+              <w:bottom w:type="dxa" w:w="50"/>
+              <w:right w:type="dxa" w:w="90"/>
+            </w:tcMar>
+          </w:tcPr>
+          <w:p>
+            <w:pPr>
+              <w:spacing w:after="0"/>
+              <w:jc w:val="left"/>
             </w:pPr>
             <w:r>
               <w:rPr>
@@ -3643,15 +3693,16 @@
               <w:right w:val="single" w:color="999999" w:sz="4"/>
             </w:tcBorders>
             <w:tcMar>
-              <w:top w:type="dxa" w:w="60"/>
-              <w:left w:type="dxa" w:w="100"/>
-              <w:bottom w:type="dxa" w:w="60"/>
-              <w:right w:type="dxa" w:w="100"/>
-            </w:tcMar>
-          </w:tcPr>
-          <w:p>
-            <w:pPr>
-              <w:spacing w:after="0"/>
+              <w:top w:type="dxa" w:w="50"/>
+              <w:left w:type="dxa" w:w="90"/>
+              <w:bottom w:type="dxa" w:w="50"/>
+              <w:right w:type="dxa" w:w="90"/>
+            </w:tcMar>
+          </w:tcPr>
+          <w:p>
+            <w:pPr>
+              <w:spacing w:after="0"/>
+              <w:jc w:val="left"/>
             </w:pPr>
             <w:r>
               <w:rPr>
@@ -3678,15 +3729,16 @@
               <w:right w:val="single" w:color="999999" w:sz="4"/>
             </w:tcBorders>
             <w:tcMar>
-              <w:top w:type="dxa" w:w="60"/>
-              <w:left w:type="dxa" w:w="100"/>
-              <w:bottom w:type="dxa" w:w="60"/>
-              <w:right w:type="dxa" w:w="100"/>
-            </w:tcMar>
-          </w:tcPr>
-          <w:p>
-            <w:pPr>
-              <w:spacing w:after="0"/>
+              <w:top w:type="dxa" w:w="50"/>
+              <w:left w:type="dxa" w:w="90"/>
+              <w:bottom w:type="dxa" w:w="50"/>
+              <w:right w:type="dxa" w:w="90"/>
+            </w:tcMar>
+          </w:tcPr>
+          <w:p>
+            <w:pPr>
+              <w:spacing w:after="0"/>
+              <w:jc w:val="left"/>
             </w:pPr>
             <w:r>
               <w:rPr>
@@ -3708,15 +3760,16 @@
               <w:right w:val="single" w:color="999999" w:sz="4"/>
             </w:tcBorders>
             <w:tcMar>
-              <w:top w:type="dxa" w:w="60"/>
-              <w:left w:type="dxa" w:w="100"/>
-              <w:bottom w:type="dxa" w:w="60"/>
-              <w:right w:type="dxa" w:w="100"/>
-            </w:tcMar>
-          </w:tcPr>
-          <w:p>
-            <w:pPr>
-              <w:spacing w:after="0"/>
+              <w:top w:type="dxa" w:w="50"/>
+              <w:left w:type="dxa" w:w="90"/>
+              <w:bottom w:type="dxa" w:w="50"/>
+              <w:right w:type="dxa" w:w="90"/>
+            </w:tcMar>
+          </w:tcPr>
+          <w:p>
+            <w:pPr>
+              <w:spacing w:after="0"/>
+              <w:jc w:val="left"/>
             </w:pPr>
             <w:r>
               <w:rPr>
@@ -3738,15 +3791,16 @@
               <w:right w:val="single" w:color="999999" w:sz="4"/>
             </w:tcBorders>
             <w:tcMar>
-              <w:top w:type="dxa" w:w="60"/>
-              <w:left w:type="dxa" w:w="100"/>
-              <w:bottom w:type="dxa" w:w="60"/>
-              <w:right w:type="dxa" w:w="100"/>
-            </w:tcMar>
-          </w:tcPr>
-          <w:p>
-            <w:pPr>
-              <w:spacing w:after="0"/>
+              <w:top w:type="dxa" w:w="50"/>
+              <w:left w:type="dxa" w:w="90"/>
+              <w:bottom w:type="dxa" w:w="50"/>
+              <w:right w:type="dxa" w:w="90"/>
+            </w:tcMar>
+          </w:tcPr>
+          <w:p>
+            <w:pPr>
+              <w:spacing w:after="0"/>
+              <w:jc w:val="left"/>
             </w:pPr>
             <w:r>
               <w:rPr>
@@ -3773,15 +3827,16 @@
               <w:right w:val="single" w:color="999999" w:sz="4"/>
             </w:tcBorders>
             <w:tcMar>
-              <w:top w:type="dxa" w:w="60"/>
-              <w:left w:type="dxa" w:w="100"/>
-              <w:bottom w:type="dxa" w:w="60"/>
-              <w:right w:type="dxa" w:w="100"/>
-            </w:tcMar>
-          </w:tcPr>
-          <w:p>
-            <w:pPr>
-              <w:spacing w:after="0"/>
+              <w:top w:type="dxa" w:w="50"/>
+              <w:left w:type="dxa" w:w="90"/>
+              <w:bottom w:type="dxa" w:w="50"/>
+              <w:right w:type="dxa" w:w="90"/>
+            </w:tcMar>
+          </w:tcPr>
+          <w:p>
+            <w:pPr>
+              <w:spacing w:after="0"/>
+              <w:jc w:val="left"/>
             </w:pPr>
             <w:r>
               <w:rPr>
@@ -3803,15 +3858,16 @@
               <w:right w:val="single" w:color="999999" w:sz="4"/>
             </w:tcBorders>
             <w:tcMar>
-              <w:top w:type="dxa" w:w="60"/>
-              <w:left w:type="dxa" w:w="100"/>
-              <w:bottom w:type="dxa" w:w="60"/>
-              <w:right w:type="dxa" w:w="100"/>
-            </w:tcMar>
-          </w:tcPr>
-          <w:p>
-            <w:pPr>
-              <w:spacing w:after="0"/>
+              <w:top w:type="dxa" w:w="50"/>
+              <w:left w:type="dxa" w:w="90"/>
+              <w:bottom w:type="dxa" w:w="50"/>
+              <w:right w:type="dxa" w:w="90"/>
+            </w:tcMar>
+          </w:tcPr>
+          <w:p>
+            <w:pPr>
+              <w:spacing w:after="0"/>
+              <w:jc w:val="left"/>
             </w:pPr>
             <w:r>
               <w:rPr>
@@ -3833,15 +3889,16 @@
               <w:right w:val="single" w:color="999999" w:sz="4"/>
             </w:tcBorders>
             <w:tcMar>
-              <w:top w:type="dxa" w:w="60"/>
-              <w:left w:type="dxa" w:w="100"/>
-              <w:bottom w:type="dxa" w:w="60"/>
-              <w:right w:type="dxa" w:w="100"/>
-            </w:tcMar>
-          </w:tcPr>
-          <w:p>
-            <w:pPr>
-              <w:spacing w:after="0"/>
+              <w:top w:type="dxa" w:w="50"/>
+              <w:left w:type="dxa" w:w="90"/>
+              <w:bottom w:type="dxa" w:w="50"/>
+              <w:right w:type="dxa" w:w="90"/>
+            </w:tcMar>
+          </w:tcPr>
+          <w:p>
+            <w:pPr>
+              <w:spacing w:after="0"/>
+              <w:jc w:val="left"/>
             </w:pPr>
             <w:r>
               <w:rPr>
@@ -3868,15 +3925,16 @@
               <w:right w:val="single" w:color="999999" w:sz="4"/>
             </w:tcBorders>
             <w:tcMar>
-              <w:top w:type="dxa" w:w="60"/>
-              <w:left w:type="dxa" w:w="100"/>
-              <w:bottom w:type="dxa" w:w="60"/>
-              <w:right w:type="dxa" w:w="100"/>
-            </w:tcMar>
-          </w:tcPr>
-          <w:p>
-            <w:pPr>
-              <w:spacing w:after="0"/>
+              <w:top w:type="dxa" w:w="50"/>
+              <w:left w:type="dxa" w:w="90"/>
+              <w:bottom w:type="dxa" w:w="50"/>
+              <w:right w:type="dxa" w:w="90"/>
+            </w:tcMar>
+          </w:tcPr>
+          <w:p>
+            <w:pPr>
+              <w:spacing w:after="0"/>
+              <w:jc w:val="left"/>
             </w:pPr>
             <w:r>
               <w:rPr>
@@ -3898,15 +3956,16 @@
               <w:right w:val="single" w:color="999999" w:sz="4"/>
             </w:tcBorders>
             <w:tcMar>
-              <w:top w:type="dxa" w:w="60"/>
-              <w:left w:type="dxa" w:w="100"/>
-              <w:bottom w:type="dxa" w:w="60"/>
-              <w:right w:type="dxa" w:w="100"/>
-            </w:tcMar>
-          </w:tcPr>
-          <w:p>
-            <w:pPr>
-              <w:spacing w:after="0"/>
+              <w:top w:type="dxa" w:w="50"/>
+              <w:left w:type="dxa" w:w="90"/>
+              <w:bottom w:type="dxa" w:w="50"/>
+              <w:right w:type="dxa" w:w="90"/>
+            </w:tcMar>
+          </w:tcPr>
+          <w:p>
+            <w:pPr>
+              <w:spacing w:after="0"/>
+              <w:jc w:val="left"/>
             </w:pPr>
             <w:r>
               <w:rPr>
@@ -3928,15 +3987,16 @@
               <w:right w:val="single" w:color="999999" w:sz="4"/>
             </w:tcBorders>
             <w:tcMar>
-              <w:top w:type="dxa" w:w="60"/>
-              <w:left w:type="dxa" w:w="100"/>
-              <w:bottom w:type="dxa" w:w="60"/>
-              <w:right w:type="dxa" w:w="100"/>
-            </w:tcMar>
-          </w:tcPr>
-          <w:p>
-            <w:pPr>
-              <w:spacing w:after="0"/>
+              <w:top w:type="dxa" w:w="50"/>
+              <w:left w:type="dxa" w:w="90"/>
+              <w:bottom w:type="dxa" w:w="50"/>
+              <w:right w:type="dxa" w:w="90"/>
+            </w:tcMar>
+          </w:tcPr>
+          <w:p>
+            <w:pPr>
+              <w:spacing w:after="0"/>
+              <w:jc w:val="left"/>
             </w:pPr>
             <w:r>
               <w:rPr>
@@ -3963,15 +4023,16 @@
               <w:right w:val="single" w:color="999999" w:sz="4"/>
             </w:tcBorders>
             <w:tcMar>
-              <w:top w:type="dxa" w:w="60"/>
-              <w:left w:type="dxa" w:w="100"/>
-              <w:bottom w:type="dxa" w:w="60"/>
-              <w:right w:type="dxa" w:w="100"/>
-            </w:tcMar>
-          </w:tcPr>
-          <w:p>
-            <w:pPr>
-              <w:spacing w:after="0"/>
+              <w:top w:type="dxa" w:w="50"/>
+              <w:left w:type="dxa" w:w="90"/>
+              <w:bottom w:type="dxa" w:w="50"/>
+              <w:right w:type="dxa" w:w="90"/>
+            </w:tcMar>
+          </w:tcPr>
+          <w:p>
+            <w:pPr>
+              <w:spacing w:after="0"/>
+              <w:jc w:val="left"/>
             </w:pPr>
             <w:r>
               <w:rPr>
@@ -3993,15 +4054,16 @@
               <w:right w:val="single" w:color="999999" w:sz="4"/>
             </w:tcBorders>
             <w:tcMar>
-              <w:top w:type="dxa" w:w="60"/>
-              <w:left w:type="dxa" w:w="100"/>
-              <w:bottom w:type="dxa" w:w="60"/>
-              <w:right w:type="dxa" w:w="100"/>
-            </w:tcMar>
-          </w:tcPr>
-          <w:p>
-            <w:pPr>
-              <w:spacing w:after="0"/>
+              <w:top w:type="dxa" w:w="50"/>
+              <w:left w:type="dxa" w:w="90"/>
+              <w:bottom w:type="dxa" w:w="50"/>
+              <w:right w:type="dxa" w:w="90"/>
+            </w:tcMar>
+          </w:tcPr>
+          <w:p>
+            <w:pPr>
+              <w:spacing w:after="0"/>
+              <w:jc w:val="left"/>
             </w:pPr>
             <w:r>
               <w:rPr>
@@ -4023,15 +4085,16 @@
               <w:right w:val="single" w:color="999999" w:sz="4"/>
             </w:tcBorders>
             <w:tcMar>
-              <w:top w:type="dxa" w:w="60"/>
-              <w:left w:type="dxa" w:w="100"/>
-              <w:bottom w:type="dxa" w:w="60"/>
-              <w:right w:type="dxa" w:w="100"/>
-            </w:tcMar>
-          </w:tcPr>
-          <w:p>
-            <w:pPr>
-              <w:spacing w:after="0"/>
+              <w:top w:type="dxa" w:w="50"/>
+              <w:left w:type="dxa" w:w="90"/>
+              <w:bottom w:type="dxa" w:w="50"/>
+              <w:right w:type="dxa" w:w="90"/>
+            </w:tcMar>
+          </w:tcPr>
+          <w:p>
+            <w:pPr>
+              <w:spacing w:after="0"/>
+              <w:jc w:val="left"/>
             </w:pPr>
             <w:r>
               <w:rPr>
@@ -4058,15 +4121,16 @@
               <w:right w:val="single" w:color="999999" w:sz="4"/>
             </w:tcBorders>
             <w:tcMar>
-              <w:top w:type="dxa" w:w="60"/>
-              <w:left w:type="dxa" w:w="100"/>
-              <w:bottom w:type="dxa" w:w="60"/>
-              <w:right w:type="dxa" w:w="100"/>
-            </w:tcMar>
-          </w:tcPr>
-          <w:p>
-            <w:pPr>
-              <w:spacing w:after="0"/>
+              <w:top w:type="dxa" w:w="50"/>
+              <w:left w:type="dxa" w:w="90"/>
+              <w:bottom w:type="dxa" w:w="50"/>
+              <w:right w:type="dxa" w:w="90"/>
+            </w:tcMar>
+          </w:tcPr>
+          <w:p>
+            <w:pPr>
+              <w:spacing w:after="0"/>
+              <w:jc w:val="left"/>
             </w:pPr>
             <w:r>
               <w:rPr>
@@ -4088,15 +4152,16 @@
               <w:right w:val="single" w:color="999999" w:sz="4"/>
             </w:tcBorders>
             <w:tcMar>
-              <w:top w:type="dxa" w:w="60"/>
-              <w:left w:type="dxa" w:w="100"/>
-              <w:bottom w:type="dxa" w:w="60"/>
-              <w:right w:type="dxa" w:w="100"/>
-            </w:tcMar>
-          </w:tcPr>
-          <w:p>
-            <w:pPr>
-              <w:spacing w:after="0"/>
+              <w:top w:type="dxa" w:w="50"/>
+              <w:left w:type="dxa" w:w="90"/>
+              <w:bottom w:type="dxa" w:w="50"/>
+              <w:right w:type="dxa" w:w="90"/>
+            </w:tcMar>
+          </w:tcPr>
+          <w:p>
+            <w:pPr>
+              <w:spacing w:after="0"/>
+              <w:jc w:val="left"/>
             </w:pPr>
             <w:r>
               <w:rPr>
@@ -4118,15 +4183,16 @@
               <w:right w:val="single" w:color="999999" w:sz="4"/>
             </w:tcBorders>
             <w:tcMar>
-              <w:top w:type="dxa" w:w="60"/>
-              <w:left w:type="dxa" w:w="100"/>
-              <w:bottom w:type="dxa" w:w="60"/>
-              <w:right w:type="dxa" w:w="100"/>
-            </w:tcMar>
-          </w:tcPr>
-          <w:p>
-            <w:pPr>
-              <w:spacing w:after="0"/>
+              <w:top w:type="dxa" w:w="50"/>
+              <w:left w:type="dxa" w:w="90"/>
+              <w:bottom w:type="dxa" w:w="50"/>
+              <w:right w:type="dxa" w:w="90"/>
+            </w:tcMar>
+          </w:tcPr>
+          <w:p>
+            <w:pPr>
+              <w:spacing w:after="0"/>
+              <w:jc w:val="left"/>
             </w:pPr>
             <w:r>
               <w:rPr>
@@ -5293,9 +5359,9 @@
         </w:tblBorders>
       </w:tblPr>
       <w:tblGrid>
-        <w:gridCol w:w="2880"/>
-        <w:gridCol w:w="2880"/>
-        <w:gridCol w:w="4320"/>
+        <w:gridCol w:w="2520"/>
+        <w:gridCol w:w="2520"/>
+        <w:gridCol w:w="5040"/>
       </w:tblGrid>
       <w:tr>
         <w:trPr>
@@ -5304,7 +5370,7 @@
         </w:trPr>
         <w:tc>
           <w:tcPr>
-            <w:tcW w:type="dxa" w:w="2880"/>
+            <w:tcW w:type="dxa" w:w="2520"/>
             <w:tcBorders>
               <w:top w:val="single" w:color="999999" w:sz="4"/>
               <w:left w:val="single" w:color="999999" w:sz="4"/>
@@ -5313,15 +5379,16 @@
             </w:tcBorders>
             <w:shd w:fill="DCE6F1" w:color="auto" w:val="clear"/>
             <w:tcMar>
-              <w:top w:type="dxa" w:w="60"/>
-              <w:left w:type="dxa" w:w="100"/>
-              <w:bottom w:type="dxa" w:w="60"/>
-              <w:right w:type="dxa" w:w="100"/>
-            </w:tcMar>
-          </w:tcPr>
-          <w:p>
-            <w:pPr>
-              <w:spacing w:after="0"/>
+              <w:top w:type="dxa" w:w="50"/>
+              <w:left w:type="dxa" w:w="90"/>
+              <w:bottom w:type="dxa" w:w="50"/>
+              <w:right w:type="dxa" w:w="90"/>
+            </w:tcMar>
+          </w:tcPr>
+          <w:p>
+            <w:pPr>
+              <w:spacing w:after="0"/>
+              <w:jc w:val="left"/>
             </w:pPr>
             <w:r>
               <w:rPr>
@@ -5337,7 +5404,7 @@
         </w:tc>
         <w:tc>
           <w:tcPr>
-            <w:tcW w:type="dxa" w:w="2880"/>
+            <w:tcW w:type="dxa" w:w="2520"/>
             <w:tcBorders>
               <w:top w:val="single" w:color="999999" w:sz="4"/>
               <w:left w:val="single" w:color="999999" w:sz="4"/>
@@ -5346,15 +5413,16 @@
             </w:tcBorders>
             <w:shd w:fill="DCE6F1" w:color="auto" w:val="clear"/>
             <w:tcMar>
-              <w:top w:type="dxa" w:w="60"/>
-              <w:left w:type="dxa" w:w="100"/>
-              <w:bottom w:type="dxa" w:w="60"/>
-              <w:right w:type="dxa" w:w="100"/>
-            </w:tcMar>
-          </w:tcPr>
-          <w:p>
-            <w:pPr>
-              <w:spacing w:after="0"/>
+              <w:top w:type="dxa" w:w="50"/>
+              <w:left w:type="dxa" w:w="90"/>
+              <w:bottom w:type="dxa" w:w="50"/>
+              <w:right w:type="dxa" w:w="90"/>
+            </w:tcMar>
+          </w:tcPr>
+          <w:p>
+            <w:pPr>
+              <w:spacing w:after="0"/>
+              <w:jc w:val="left"/>
             </w:pPr>
             <w:r>
               <w:rPr>
@@ -5370,7 +5438,7 @@
         </w:tc>
         <w:tc>
           <w:tcPr>
-            <w:tcW w:type="dxa" w:w="4320"/>
+            <w:tcW w:type="dxa" w:w="5040"/>
             <w:tcBorders>
               <w:top w:val="single" w:color="999999" w:sz="4"/>
               <w:left w:val="single" w:color="999999" w:sz="4"/>
@@ -5379,15 +5447,16 @@
             </w:tcBorders>
             <w:shd w:fill="DCE6F1" w:color="auto" w:val="clear"/>
             <w:tcMar>
-              <w:top w:type="dxa" w:w="60"/>
-              <w:left w:type="dxa" w:w="100"/>
-              <w:bottom w:type="dxa" w:w="60"/>
-              <w:right w:type="dxa" w:w="100"/>
-            </w:tcMar>
-          </w:tcPr>
-          <w:p>
-            <w:pPr>
-              <w:spacing w:after="0"/>
+              <w:top w:type="dxa" w:w="50"/>
+              <w:left w:type="dxa" w:w="90"/>
+              <w:bottom w:type="dxa" w:w="50"/>
+              <w:right w:type="dxa" w:w="90"/>
+            </w:tcMar>
+          </w:tcPr>
+          <w:p>
+            <w:pPr>
+              <w:spacing w:after="0"/>
+              <w:jc w:val="left"/>
             </w:pPr>
             <w:r>
               <w:rPr>
@@ -5408,23 +5477,24 @@
         </w:trPr>
         <w:tc>
           <w:tcPr>
-            <w:tcW w:type="dxa" w:w="2880"/>
-            <w:tcBorders>
-              <w:top w:val="single" w:color="999999" w:sz="4"/>
-              <w:left w:val="single" w:color="999999" w:sz="4"/>
-              <w:bottom w:val="single" w:color="999999" w:sz="4"/>
-              <w:right w:val="single" w:color="999999" w:sz="4"/>
-            </w:tcBorders>
-            <w:tcMar>
-              <w:top w:type="dxa" w:w="60"/>
-              <w:left w:type="dxa" w:w="100"/>
-              <w:bottom w:type="dxa" w:w="60"/>
-              <w:right w:type="dxa" w:w="100"/>
-            </w:tcMar>
-          </w:tcPr>
-          <w:p>
-            <w:pPr>
-              <w:spacing w:after="0"/>
+            <w:tcW w:type="dxa" w:w="2520"/>
+            <w:tcBorders>
+              <w:top w:val="single" w:color="999999" w:sz="4"/>
+              <w:left w:val="single" w:color="999999" w:sz="4"/>
+              <w:bottom w:val="single" w:color="999999" w:sz="4"/>
+              <w:right w:val="single" w:color="999999" w:sz="4"/>
+            </w:tcBorders>
+            <w:tcMar>
+              <w:top w:type="dxa" w:w="50"/>
+              <w:left w:type="dxa" w:w="90"/>
+              <w:bottom w:type="dxa" w:w="50"/>
+              <w:right w:type="dxa" w:w="90"/>
+            </w:tcMar>
+          </w:tcPr>
+          <w:p>
+            <w:pPr>
+              <w:spacing w:after="0"/>
+              <w:jc w:val="left"/>
             </w:pPr>
             <w:r>
               <w:rPr>
@@ -5438,23 +5508,24 @@
         </w:tc>
         <w:tc>
           <w:tcPr>
-            <w:tcW w:type="dxa" w:w="2880"/>
-            <w:tcBorders>
-              <w:top w:val="single" w:color="999999" w:sz="4"/>
-              <w:left w:val="single" w:color="999999" w:sz="4"/>
-              <w:bottom w:val="single" w:color="999999" w:sz="4"/>
-              <w:right w:val="single" w:color="999999" w:sz="4"/>
-            </w:tcBorders>
-            <w:tcMar>
-              <w:top w:type="dxa" w:w="60"/>
-              <w:left w:type="dxa" w:w="100"/>
-              <w:bottom w:type="dxa" w:w="60"/>
-              <w:right w:type="dxa" w:w="100"/>
-            </w:tcMar>
-          </w:tcPr>
-          <w:p>
-            <w:pPr>
-              <w:spacing w:after="0"/>
+            <w:tcW w:type="dxa" w:w="2520"/>
+            <w:tcBorders>
+              <w:top w:val="single" w:color="999999" w:sz="4"/>
+              <w:left w:val="single" w:color="999999" w:sz="4"/>
+              <w:bottom w:val="single" w:color="999999" w:sz="4"/>
+              <w:right w:val="single" w:color="999999" w:sz="4"/>
+            </w:tcBorders>
+            <w:tcMar>
+              <w:top w:type="dxa" w:w="50"/>
+              <w:left w:type="dxa" w:w="90"/>
+              <w:bottom w:type="dxa" w:w="50"/>
+              <w:right w:type="dxa" w:w="90"/>
+            </w:tcMar>
+          </w:tcPr>
+          <w:p>
+            <w:pPr>
+              <w:spacing w:after="0"/>
+              <w:jc w:val="left"/>
             </w:pPr>
             <w:r>
               <w:rPr>
@@ -5468,23 +5539,24 @@
         </w:tc>
         <w:tc>
           <w:tcPr>
-            <w:tcW w:type="dxa" w:w="4320"/>
-            <w:tcBorders>
-              <w:top w:val="single" w:color="999999" w:sz="4"/>
-              <w:left w:val="single" w:color="999999" w:sz="4"/>
-              <w:bottom w:val="single" w:color="999999" w:sz="4"/>
-              <w:right w:val="single" w:color="999999" w:sz="4"/>
-            </w:tcBorders>
-            <w:tcMar>
-              <w:top w:type="dxa" w:w="60"/>
-              <w:left w:type="dxa" w:w="100"/>
-              <w:bottom w:type="dxa" w:w="60"/>
-              <w:right w:type="dxa" w:w="100"/>
-            </w:tcMar>
-          </w:tcPr>
-          <w:p>
-            <w:pPr>
-              <w:spacing w:after="0"/>
+            <w:tcW w:type="dxa" w:w="5040"/>
+            <w:tcBorders>
+              <w:top w:val="single" w:color="999999" w:sz="4"/>
+              <w:left w:val="single" w:color="999999" w:sz="4"/>
+              <w:bottom w:val="single" w:color="999999" w:sz="4"/>
+              <w:right w:val="single" w:color="999999" w:sz="4"/>
+            </w:tcBorders>
+            <w:tcMar>
+              <w:top w:type="dxa" w:w="50"/>
+              <w:left w:type="dxa" w:w="90"/>
+              <w:bottom w:type="dxa" w:w="50"/>
+              <w:right w:type="dxa" w:w="90"/>
+            </w:tcMar>
+          </w:tcPr>
+          <w:p>
+            <w:pPr>
+              <w:spacing w:after="0"/>
+              <w:jc w:val="left"/>
             </w:pPr>
             <w:r>
               <w:rPr>
@@ -5503,23 +5575,24 @@
         </w:trPr>
         <w:tc>
           <w:tcPr>
-            <w:tcW w:type="dxa" w:w="2880"/>
-            <w:tcBorders>
-              <w:top w:val="single" w:color="999999" w:sz="4"/>
-              <w:left w:val="single" w:color="999999" w:sz="4"/>
-              <w:bottom w:val="single" w:color="999999" w:sz="4"/>
-              <w:right w:val="single" w:color="999999" w:sz="4"/>
-            </w:tcBorders>
-            <w:tcMar>
-              <w:top w:type="dxa" w:w="60"/>
-              <w:left w:type="dxa" w:w="100"/>
-              <w:bottom w:type="dxa" w:w="60"/>
-              <w:right w:type="dxa" w:w="100"/>
-            </w:tcMar>
-          </w:tcPr>
-          <w:p>
-            <w:pPr>
-              <w:spacing w:after="0"/>
+            <w:tcW w:type="dxa" w:w="2520"/>
+            <w:tcBorders>
+              <w:top w:val="single" w:color="999999" w:sz="4"/>
+              <w:left w:val="single" w:color="999999" w:sz="4"/>
+              <w:bottom w:val="single" w:color="999999" w:sz="4"/>
+              <w:right w:val="single" w:color="999999" w:sz="4"/>
+            </w:tcBorders>
+            <w:tcMar>
+              <w:top w:type="dxa" w:w="50"/>
+              <w:left w:type="dxa" w:w="90"/>
+              <w:bottom w:type="dxa" w:w="50"/>
+              <w:right w:type="dxa" w:w="90"/>
+            </w:tcMar>
+          </w:tcPr>
+          <w:p>
+            <w:pPr>
+              <w:spacing w:after="0"/>
+              <w:jc w:val="left"/>
             </w:pPr>
             <w:r>
               <w:rPr>
@@ -5533,23 +5606,24 @@
         </w:tc>
         <w:tc>
           <w:tcPr>
-            <w:tcW w:type="dxa" w:w="2880"/>
-            <w:tcBorders>
-              <w:top w:val="single" w:color="999999" w:sz="4"/>
-              <w:left w:val="single" w:color="999999" w:sz="4"/>
-              <w:bottom w:val="single" w:color="999999" w:sz="4"/>
-              <w:right w:val="single" w:color="999999" w:sz="4"/>
-            </w:tcBorders>
-            <w:tcMar>
-              <w:top w:type="dxa" w:w="60"/>
-              <w:left w:type="dxa" w:w="100"/>
-              <w:bottom w:type="dxa" w:w="60"/>
-              <w:right w:type="dxa" w:w="100"/>
-            </w:tcMar>
-          </w:tcPr>
-          <w:p>
-            <w:pPr>
-              <w:spacing w:after="0"/>
+            <w:tcW w:type="dxa" w:w="2520"/>
+            <w:tcBorders>
+              <w:top w:val="single" w:color="999999" w:sz="4"/>
+              <w:left w:val="single" w:color="999999" w:sz="4"/>
+              <w:bottom w:val="single" w:color="999999" w:sz="4"/>
+              <w:right w:val="single" w:color="999999" w:sz="4"/>
+            </w:tcBorders>
+            <w:tcMar>
+              <w:top w:type="dxa" w:w="50"/>
+              <w:left w:type="dxa" w:w="90"/>
+              <w:bottom w:type="dxa" w:w="50"/>
+              <w:right w:type="dxa" w:w="90"/>
+            </w:tcMar>
+          </w:tcPr>
+          <w:p>
+            <w:pPr>
+              <w:spacing w:after="0"/>
+              <w:jc w:val="left"/>
             </w:pPr>
             <w:r>
               <w:rPr>
@@ -5563,23 +5637,24 @@
         </w:tc>
         <w:tc>
           <w:tcPr>
-            <w:tcW w:type="dxa" w:w="4320"/>
-            <w:tcBorders>
-              <w:top w:val="single" w:color="999999" w:sz="4"/>
-              <w:left w:val="single" w:color="999999" w:sz="4"/>
-              <w:bottom w:val="single" w:color="999999" w:sz="4"/>
-              <w:right w:val="single" w:color="999999" w:sz="4"/>
-            </w:tcBorders>
-            <w:tcMar>
-              <w:top w:type="dxa" w:w="60"/>
-              <w:left w:type="dxa" w:w="100"/>
-              <w:bottom w:type="dxa" w:w="60"/>
-              <w:right w:type="dxa" w:w="100"/>
-            </w:tcMar>
-          </w:tcPr>
-          <w:p>
-            <w:pPr>
-              <w:spacing w:after="0"/>
+            <w:tcW w:type="dxa" w:w="5040"/>
+            <w:tcBorders>
+              <w:top w:val="single" w:color="999999" w:sz="4"/>
+              <w:left w:val="single" w:color="999999" w:sz="4"/>
+              <w:bottom w:val="single" w:color="999999" w:sz="4"/>
+              <w:right w:val="single" w:color="999999" w:sz="4"/>
+            </w:tcBorders>
+            <w:tcMar>
+              <w:top w:type="dxa" w:w="50"/>
+              <w:left w:type="dxa" w:w="90"/>
+              <w:bottom w:type="dxa" w:w="50"/>
+              <w:right w:type="dxa" w:w="90"/>
+            </w:tcMar>
+          </w:tcPr>
+          <w:p>
+            <w:pPr>
+              <w:spacing w:after="0"/>
+              <w:jc w:val="left"/>
             </w:pPr>
             <w:r>
               <w:rPr>
@@ -5598,23 +5673,24 @@
         </w:trPr>
         <w:tc>
           <w:tcPr>
-            <w:tcW w:type="dxa" w:w="2880"/>
-            <w:tcBorders>
-              <w:top w:val="single" w:color="999999" w:sz="4"/>
-              <w:left w:val="single" w:color="999999" w:sz="4"/>
-              <w:bottom w:val="single" w:color="999999" w:sz="4"/>
-              <w:right w:val="single" w:color="999999" w:sz="4"/>
-            </w:tcBorders>
-            <w:tcMar>
-              <w:top w:type="dxa" w:w="60"/>
-              <w:left w:type="dxa" w:w="100"/>
-              <w:bottom w:type="dxa" w:w="60"/>
-              <w:right w:type="dxa" w:w="100"/>
-            </w:tcMar>
-          </w:tcPr>
-          <w:p>
-            <w:pPr>
-              <w:spacing w:after="0"/>
+            <w:tcW w:type="dxa" w:w="2520"/>
+            <w:tcBorders>
+              <w:top w:val="single" w:color="999999" w:sz="4"/>
+              <w:left w:val="single" w:color="999999" w:sz="4"/>
+              <w:bottom w:val="single" w:color="999999" w:sz="4"/>
+              <w:right w:val="single" w:color="999999" w:sz="4"/>
+            </w:tcBorders>
+            <w:tcMar>
+              <w:top w:type="dxa" w:w="50"/>
+              <w:left w:type="dxa" w:w="90"/>
+              <w:bottom w:type="dxa" w:w="50"/>
+              <w:right w:type="dxa" w:w="90"/>
+            </w:tcMar>
+          </w:tcPr>
+          <w:p>
+            <w:pPr>
+              <w:spacing w:after="0"/>
+              <w:jc w:val="left"/>
             </w:pPr>
             <w:r>
               <w:rPr>
@@ -5628,23 +5704,24 @@
         </w:tc>
         <w:tc>
           <w:tcPr>
-            <w:tcW w:type="dxa" w:w="2880"/>
-            <w:tcBorders>
-              <w:top w:val="single" w:color="999999" w:sz="4"/>
-              <w:left w:val="single" w:color="999999" w:sz="4"/>
-              <w:bottom w:val="single" w:color="999999" w:sz="4"/>
-              <w:right w:val="single" w:color="999999" w:sz="4"/>
-            </w:tcBorders>
-            <w:tcMar>
-              <w:top w:type="dxa" w:w="60"/>
-              <w:left w:type="dxa" w:w="100"/>
-              <w:bottom w:type="dxa" w:w="60"/>
-              <w:right w:type="dxa" w:w="100"/>
-            </w:tcMar>
-          </w:tcPr>
-          <w:p>
-            <w:pPr>
-              <w:spacing w:after="0"/>
+            <w:tcW w:type="dxa" w:w="2520"/>
+            <w:tcBorders>
+              <w:top w:val="single" w:color="999999" w:sz="4"/>
+              <w:left w:val="single" w:color="999999" w:sz="4"/>
+              <w:bottom w:val="single" w:color="999999" w:sz="4"/>
+              <w:right w:val="single" w:color="999999" w:sz="4"/>
+            </w:tcBorders>
+            <w:tcMar>
+              <w:top w:type="dxa" w:w="50"/>
+              <w:left w:type="dxa" w:w="90"/>
+              <w:bottom w:type="dxa" w:w="50"/>
+              <w:right w:type="dxa" w:w="90"/>
+            </w:tcMar>
+          </w:tcPr>
+          <w:p>
+            <w:pPr>
+              <w:spacing w:after="0"/>
+              <w:jc w:val="left"/>
             </w:pPr>
             <w:r>
               <w:rPr>
@@ -5658,23 +5735,24 @@
         </w:tc>
         <w:tc>
           <w:tcPr>
-            <w:tcW w:type="dxa" w:w="4320"/>
-            <w:tcBorders>
-              <w:top w:val="single" w:color="999999" w:sz="4"/>
-              <w:left w:val="single" w:color="999999" w:sz="4"/>
-              <w:bottom w:val="single" w:color="999999" w:sz="4"/>
-              <w:right w:val="single" w:color="999999" w:sz="4"/>
-            </w:tcBorders>
-            <w:tcMar>
-              <w:top w:type="dxa" w:w="60"/>
-              <w:left w:type="dxa" w:w="100"/>
-              <w:bottom w:type="dxa" w:w="60"/>
-              <w:right w:type="dxa" w:w="100"/>
-            </w:tcMar>
-          </w:tcPr>
-          <w:p>
-            <w:pPr>
-              <w:spacing w:after="0"/>
+            <w:tcW w:type="dxa" w:w="5040"/>
+            <w:tcBorders>
+              <w:top w:val="single" w:color="999999" w:sz="4"/>
+              <w:left w:val="single" w:color="999999" w:sz="4"/>
+              <w:bottom w:val="single" w:color="999999" w:sz="4"/>
+              <w:right w:val="single" w:color="999999" w:sz="4"/>
+            </w:tcBorders>
+            <w:tcMar>
+              <w:top w:type="dxa" w:w="50"/>
+              <w:left w:type="dxa" w:w="90"/>
+              <w:bottom w:type="dxa" w:w="50"/>
+              <w:right w:type="dxa" w:w="90"/>
+            </w:tcMar>
+          </w:tcPr>
+          <w:p>
+            <w:pPr>
+              <w:spacing w:after="0"/>
+              <w:jc w:val="left"/>
             </w:pPr>
             <w:r>
               <w:rPr>
@@ -6386,5 +6464,23 @@
       <w:szCs w:val="24"/>
     </w:rPr>
   </w:style>
+  <w:style w:type="paragraph" w:styleId="Heading3">
+    <w:name w:val="Heading 3"/>
+    <w:basedOn w:val="Normal"/>
+    <w:next w:val="Normal"/>
+    <w:qFormat/>
+    <w:pPr>
+      <w:spacing w:after="60" w:before="160"/>
+      <w:outlineLvl w:val="2"/>
+    </w:pPr>
+    <w:rPr>
+      <w:rFonts w:ascii="Arial" w:cs="Arial" w:eastAsia="Arial" w:hAnsi="Arial"/>
+      <w:b/>
+      <w:bCs/>
+      <w:color w:val="404040"/>
+      <w:sz w:val="22"/>
+      <w:szCs w:val="22"/>
+    </w:rPr>
+  </w:style>
 </w:styles>
 </file>
</xml_diff>